<commit_message>
test(Compilers): add audit against the course guides; align KP2 test plan wording
audit.py extracts the required report structure and test-plan types straight from
the guide PDFs and checks reports, code (vs the course samples), the specification
and the Word_KPI course folder: 124 checks, all pass. KP2 test groups now use the
exact wording of table 1 of the guide, with nested constructs as a separate group.
</commit_message>
<xml_diff>
--- a/Year-3/Semester-1/Compilers/KP/KP2/ТВ-43.КП_2.СтепаненкоНЮ.docx
+++ b/Year-3/Semester-1/Compilers/KP/KP2/ТВ-43.КП_2.СтепаненкоНЮ.docx
@@ -2199,7 +2199,7 @@
                 <w:rFonts w:ascii="Times New Roman" w:eastAsia="Times New Roman" w:hAnsi="Times New Roman" w:cs="Times New Roman"/>
                 <w:sz w:val="19"/>
               </w:rPr>
-              <w:t>ключове слово</w:t>
+              <w:t>помилка у наборі ключового слова</w:t>
             </w:r>
           </w:p>
         </w:tc>
@@ -2257,7 +2257,7 @@
                 <w:rFonts w:ascii="Times New Roman" w:eastAsia="Times New Roman" w:hAnsi="Times New Roman" w:cs="Times New Roman"/>
                 <w:sz w:val="19"/>
               </w:rPr>
-              <w:t>помилковий оператор</w:t>
+              <w:t>помилковий оператор у виразах</w:t>
             </w:r>
           </w:p>
         </w:tc>
@@ -2315,7 +2315,7 @@
                 <w:rFonts w:ascii="Times New Roman" w:eastAsia="Times New Roman" w:hAnsi="Times New Roman" w:cs="Times New Roman"/>
                 <w:sz w:val="19"/>
               </w:rPr>
-              <w:t>пріоритет</w:t>
+              <w:t>перевірка пріоритетності операторів</w:t>
             </w:r>
           </w:p>
         </w:tc>
@@ -2373,7 +2373,7 @@
                 <w:rFonts w:ascii="Times New Roman" w:eastAsia="Times New Roman" w:hAnsi="Times New Roman" w:cs="Times New Roman"/>
                 <w:sz w:val="19"/>
               </w:rPr>
-              <w:t>асоціативність</w:t>
+              <w:t>перевірка асоціативності операторів</w:t>
             </w:r>
           </w:p>
         </w:tc>
@@ -2417,7 +2417,7 @@
                 <w:rFonts w:ascii="Times New Roman" w:eastAsia="Times New Roman" w:hAnsi="Times New Roman" w:cs="Times New Roman"/>
                 <w:sz w:val="19"/>
               </w:rPr>
-              <w:t>7</w:t>
+              <w:t>8</w:t>
             </w:r>
           </w:p>
         </w:tc>
@@ -2431,7 +2431,7 @@
                 <w:rFonts w:ascii="Times New Roman" w:eastAsia="Times New Roman" w:hAnsi="Times New Roman" w:cs="Times New Roman"/>
                 <w:sz w:val="19"/>
               </w:rPr>
-              <w:t>програми</w:t>
+              <w:t>коректні програми</w:t>
             </w:r>
           </w:p>
         </w:tc>
@@ -2459,7 +2459,7 @@
                 <w:rFonts w:ascii="Times New Roman" w:eastAsia="Times New Roman" w:hAnsi="Times New Roman" w:cs="Times New Roman"/>
                 <w:sz w:val="19"/>
               </w:rPr>
-              <w:t>10</w:t>
+              <w:t>9</w:t>
             </w:r>
           </w:p>
         </w:tc>
@@ -2475,7 +2475,65 @@
                 <w:rFonts w:ascii="Times New Roman" w:eastAsia="Times New Roman" w:hAnsi="Times New Roman" w:cs="Times New Roman"/>
                 <w:sz w:val="19"/>
               </w:rPr>
-              <w:t>8</w:t>
+              <w:t>7</w:t>
+            </w:r>
+          </w:p>
+        </w:tc>
+        <w:tc>
+          <w:tcPr>
+            <w:tcW w:w="2835" w:type="dxa"/>
+          </w:tcPr>
+          <w:p>
+            <w:r>
+              <w:rPr>
+                <w:rFonts w:ascii="Times New Roman" w:eastAsia="Times New Roman" w:hAnsi="Times New Roman" w:cs="Times New Roman"/>
+                <w:sz w:val="19"/>
+              </w:rPr>
+              <w:t>вкладені конструкції</w:t>
+            </w:r>
+          </w:p>
+        </w:tc>
+        <w:tc>
+          <w:tcPr>
+            <w:tcW w:w="5102" w:type="dxa"/>
+          </w:tcPr>
+          <w:p>
+            <w:r>
+              <w:rPr>
+                <w:rFonts w:ascii="Times New Roman" w:eastAsia="Times New Roman" w:hAnsi="Times New Roman" w:cs="Times New Roman"/>
+                <w:sz w:val="19"/>
+              </w:rPr>
+              <w:t>успішний розбір</w:t>
+            </w:r>
+          </w:p>
+        </w:tc>
+        <w:tc>
+          <w:tcPr>
+            <w:tcW w:w="1020" w:type="dxa"/>
+          </w:tcPr>
+          <w:p>
+            <w:r>
+              <w:rPr>
+                <w:rFonts w:ascii="Times New Roman" w:eastAsia="Times New Roman" w:hAnsi="Times New Roman" w:cs="Times New Roman"/>
+                <w:sz w:val="19"/>
+              </w:rPr>
+              <w:t>1</w:t>
+            </w:r>
+          </w:p>
+        </w:tc>
+      </w:tr>
+      <w:tr>
+        <w:tc>
+          <w:tcPr>
+            <w:tcW w:w="454" w:type="dxa"/>
+          </w:tcPr>
+          <w:p>
+            <w:r>
+              <w:rPr>
+                <w:rFonts w:ascii="Times New Roman" w:eastAsia="Times New Roman" w:hAnsi="Times New Roman" w:cs="Times New Roman"/>
+                <w:sz w:val="19"/>
+              </w:rPr>
+              <w:t>9</w:t>
             </w:r>
           </w:p>
         </w:tc>
@@ -2705,6 +2763,7 @@
           <w:rFonts w:ascii="Consolas" w:eastAsia="Consolas" w:hAnsi="Consolas" w:cs="Consolas"/>
           <w:sz w:val="16"/>
         </w:rPr>
+        <w:lastRenderedPageBreak/>
         <w:t xml:space="preserve"> 9  }</w:t>
       </w:r>
     </w:p>
@@ -2724,7 +2783,6 @@
           <w:rFonts w:ascii="Consolas" w:eastAsia="Consolas" w:hAnsi="Consolas" w:cs="Consolas"/>
           <w:sz w:val="16"/>
         </w:rPr>
-        <w:lastRenderedPageBreak/>
         <w:t>&gt;python krok_parse.py test.krok</w:t>
       </w:r>
     </w:p>
@@ -3461,6 +3519,7 @@
           <w:rFonts w:ascii="Consolas" w:eastAsia="Consolas" w:hAnsi="Consolas" w:cs="Consolas"/>
           <w:sz w:val="16"/>
         </w:rPr>
+        <w:lastRenderedPageBreak/>
         <w:t xml:space="preserve"> 4  </w:t>
       </w:r>
     </w:p>
@@ -3503,7 +3562,6 @@
           <w:rFonts w:ascii="Consolas" w:eastAsia="Consolas" w:hAnsi="Consolas" w:cs="Consolas"/>
           <w:sz w:val="16"/>
         </w:rPr>
-        <w:lastRenderedPageBreak/>
         <w:t xml:space="preserve"> 7  }</w:t>
       </w:r>
     </w:p>
@@ -4133,7 +4191,7 @@
           <w:b/>
           <w:sz w:val="24"/>
         </w:rPr>
-        <w:t>Тест № 7 (3 ключове слово): fucn.</w:t>
+        <w:t>Тест № 7 (3 помилка у наборі ключового слова): fucn.</w:t>
       </w:r>
     </w:p>
     <w:p>
@@ -4194,6 +4252,7 @@
           <w:rFonts w:ascii="Consolas" w:eastAsia="Consolas" w:hAnsi="Consolas" w:cs="Consolas"/>
           <w:sz w:val="16"/>
         </w:rPr>
+        <w:lastRenderedPageBreak/>
         <w:t>&gt;python krok_parse.py test.krok</w:t>
       </w:r>
     </w:p>
@@ -4236,7 +4295,6 @@
           <w:rFonts w:ascii="Consolas" w:eastAsia="Consolas" w:hAnsi="Consolas" w:cs="Consolas"/>
           <w:sz w:val="16"/>
         </w:rPr>
-        <w:lastRenderedPageBreak/>
         <w:t xml:space="preserve">    parseToken: В рядку 1 токен (';', 'punct')</w:t>
       </w:r>
     </w:p>
@@ -4339,7 +4397,7 @@
           <w:b/>
           <w:sz w:val="24"/>
         </w:rPr>
-        <w:t>Тест № 8 (3 ключове слово): retrun.</w:t>
+        <w:t>Тест № 8 (3 помилка у наборі ключового слова): retrun.</w:t>
       </w:r>
     </w:p>
     <w:p>
@@ -4600,7 +4658,7 @@
           <w:b/>
           <w:sz w:val="24"/>
         </w:rPr>
-        <w:t>Тест № 9 (4 помилковий оператор): + *.</w:t>
+        <w:t>Тест № 9 (4 помилковий оператор у виразах): + *.</w:t>
       </w:r>
     </w:p>
     <w:p>
@@ -4874,7 +4932,7 @@
           <w:b/>
           <w:sz w:val="24"/>
         </w:rPr>
-        <w:t>Тест № 10 (4 помилковий оператор): &lt;&gt;.</w:t>
+        <w:t>Тест № 10 (4 помилковий оператор у виразах): &lt;&gt;.</w:t>
       </w:r>
     </w:p>
     <w:p>
@@ -5005,7 +5063,6 @@
           <w:rFonts w:ascii="Consolas" w:eastAsia="Consolas" w:hAnsi="Consolas" w:cs="Consolas"/>
           <w:sz w:val="16"/>
         </w:rPr>
-        <w:lastRenderedPageBreak/>
         <w:t>...</w:t>
       </w:r>
     </w:p>
@@ -5149,7 +5206,7 @@
           <w:b/>
           <w:sz w:val="24"/>
         </w:rPr>
-        <w:t>Тест № 11 (4 помилковий оператор): a &lt; b &lt; c.</w:t>
+        <w:t>Тест № 11 (4 помилковий оператор у виразах): a &lt; b &lt; c.</w:t>
       </w:r>
     </w:p>
     <w:p>
@@ -5423,7 +5480,7 @@
           <w:b/>
           <w:sz w:val="24"/>
         </w:rPr>
-        <w:t>Тест № 12 (5 пріоритет): a + b * c.</w:t>
+        <w:t>Тест № 12 (5 перевірка пріоритетності операторів): a + b * c.</w:t>
       </w:r>
     </w:p>
     <w:p>
@@ -5834,6 +5891,7 @@
           <w:rFonts w:ascii="Consolas" w:eastAsia="Consolas" w:hAnsi="Consolas" w:cs="Consolas"/>
           <w:sz w:val="16"/>
         </w:rPr>
+        <w:lastRenderedPageBreak/>
         <w:t xml:space="preserve">                            parseUnaryExpr():</w:t>
       </w:r>
     </w:p>
@@ -5876,7 +5934,6 @@
           <w:rFonts w:ascii="Consolas" w:eastAsia="Consolas" w:hAnsi="Consolas" w:cs="Consolas"/>
           <w:sz w:val="16"/>
         </w:rPr>
-        <w:lastRenderedPageBreak/>
         <w:t xml:space="preserve">                                  parseOperand():</w:t>
       </w:r>
     </w:p>
@@ -6159,7 +6216,7 @@
           <w:b/>
           <w:sz w:val="24"/>
         </w:rPr>
-        <w:t>Тест № 13 (5 пріоритет): -2 ** 2 &amp;&amp; !f || g.</w:t>
+        <w:t>Тест № 13 (5 перевірка пріоритетності операторів): -2 ** 2 &amp;&amp; !f || g.</w:t>
       </w:r>
     </w:p>
     <w:p>
@@ -6780,6 +6837,7 @@
           <w:rFonts w:ascii="Consolas" w:eastAsia="Consolas" w:hAnsi="Consolas" w:cs="Consolas"/>
           <w:sz w:val="16"/>
         </w:rPr>
+        <w:lastRenderedPageBreak/>
         <w:t xml:space="preserve">                        parseToken: В рядку 6 токен ('&gt;', 'rel_op')</w:t>
       </w:r>
     </w:p>
@@ -6822,7 +6880,6 @@
           <w:rFonts w:ascii="Consolas" w:eastAsia="Consolas" w:hAnsi="Consolas" w:cs="Consolas"/>
           <w:sz w:val="16"/>
         </w:rPr>
-        <w:lastRenderedPageBreak/>
         <w:t xml:space="preserve">                            parseUnaryExpr():</w:t>
       </w:r>
     </w:p>
@@ -7273,7 +7330,7 @@
           <w:b/>
           <w:sz w:val="24"/>
         </w:rPr>
-        <w:t>Тест № 14 (6 асоціативність): a - b - c.</w:t>
+        <w:t>Тест № 14 (6 перевірка асоціативності операторів): a - b - c.</w:t>
       </w:r>
     </w:p>
     <w:p>
@@ -7726,6 +7783,7 @@
           <w:rFonts w:ascii="Consolas" w:eastAsia="Consolas" w:hAnsi="Consolas" w:cs="Consolas"/>
           <w:sz w:val="16"/>
         </w:rPr>
+        <w:lastRenderedPageBreak/>
         <w:t xml:space="preserve">                                  parseOperand():</w:t>
       </w:r>
     </w:p>
@@ -7768,7 +7826,6 @@
           <w:rFonts w:ascii="Consolas" w:eastAsia="Consolas" w:hAnsi="Consolas" w:cs="Consolas"/>
           <w:sz w:val="16"/>
         </w:rPr>
-        <w:lastRenderedPageBreak/>
         <w:t xml:space="preserve">                          parseMulExpr():</w:t>
       </w:r>
     </w:p>
@@ -8049,7 +8106,7 @@
           <w:b/>
           <w:sz w:val="24"/>
         </w:rPr>
-        <w:t>Тест № 15 (6 асоціативність): 2 ** 3 ** 2.</w:t>
+        <w:t>Тест № 15 (6 перевірка асоціативності операторів): 2 ** 3 ** 2.</w:t>
       </w:r>
     </w:p>
     <w:p>
@@ -8684,6 +8741,7 @@
           <w:rFonts w:ascii="Consolas" w:eastAsia="Consolas" w:hAnsi="Consolas" w:cs="Consolas"/>
           <w:sz w:val="16"/>
         </w:rPr>
+        <w:lastRenderedPageBreak/>
         <w:t xml:space="preserve">                                        parsePrimaryExpr():</w:t>
       </w:r>
     </w:p>
@@ -8726,7 +8784,6 @@
           <w:rFonts w:ascii="Consolas" w:eastAsia="Consolas" w:hAnsi="Consolas" w:cs="Consolas"/>
           <w:sz w:val="16"/>
         </w:rPr>
-        <w:lastRenderedPageBreak/>
         <w:t xml:space="preserve">                                              parseToken: В рядку 6 токен ('2', 'intnum')</w:t>
       </w:r>
     </w:p>
@@ -8839,7 +8896,7 @@
           <w:b/>
           <w:sz w:val="24"/>
         </w:rPr>
-        <w:t>Тест № 16 (7 програми): nested.krok.</w:t>
+        <w:t>Тест № 16 (7 вкладені конструкції): nested.krok.</w:t>
       </w:r>
     </w:p>
     <w:p>
@@ -9372,31 +9429,31 @@
       </w:rPr>
     </w:lvl>
   </w:abstractNum>
-  <w:num w:numId="1" w16cid:durableId="2055154731">
+  <w:num w:numId="1" w16cid:durableId="1410037465">
     <w:abstractNumId w:val="8"/>
   </w:num>
-  <w:num w:numId="2" w16cid:durableId="907036886">
+  <w:num w:numId="2" w16cid:durableId="125706594">
     <w:abstractNumId w:val="6"/>
   </w:num>
-  <w:num w:numId="3" w16cid:durableId="1373723900">
+  <w:num w:numId="3" w16cid:durableId="2021274516">
     <w:abstractNumId w:val="5"/>
   </w:num>
-  <w:num w:numId="4" w16cid:durableId="595597112">
+  <w:num w:numId="4" w16cid:durableId="1167790933">
     <w:abstractNumId w:val="4"/>
   </w:num>
-  <w:num w:numId="5" w16cid:durableId="717633285">
+  <w:num w:numId="5" w16cid:durableId="2111394298">
     <w:abstractNumId w:val="7"/>
   </w:num>
-  <w:num w:numId="6" w16cid:durableId="1149522109">
+  <w:num w:numId="6" w16cid:durableId="1584685316">
     <w:abstractNumId w:val="3"/>
   </w:num>
-  <w:num w:numId="7" w16cid:durableId="1679193318">
+  <w:num w:numId="7" w16cid:durableId="985083776">
     <w:abstractNumId w:val="2"/>
   </w:num>
-  <w:num w:numId="8" w16cid:durableId="371198975">
+  <w:num w:numId="8" w16cid:durableId="278416083">
     <w:abstractNumId w:val="1"/>
   </w:num>
-  <w:num w:numId="9" w16cid:durableId="673604555">
+  <w:num w:numId="9" w16cid:durableId="378630435">
     <w:abstractNumId w:val="0"/>
   </w:num>
 </w:numbering>

</xml_diff>